<commit_message>
fixed data via API endpoints
</commit_message>
<xml_diff>
--- a/ERP Perfume - Version History & Release Notes.docx
+++ b/ERP Perfume - Version History & Release Notes.docx
@@ -34,7 +34,7 @@
         <w:spacing w:after="40"/>
       </w:pPr>
       <w:r>
-        <w:t>Current release: v0.51.4 · Document generated 8 July 2026</w:t>
+        <w:t>Current release: v0.51.5 · Document generated 8 July 2026</w:t>
       </w:r>
     </w:p>
     <w:p>
@@ -2098,6 +2098,14 @@
     </w:p>
     <w:p>
       <w:pPr>
+        <w:pStyle w:val="ListParagraph"/>
+      </w:pPr>
+      <w:r>
+        <w:t>v0.51.5 polish — cleaned up native &lt;select&gt; controls app-wide: the Receipts customer picker (and every other dropdown) now drops the inconsistent OS arrow for a themed chevron with proper spacing so long option text never collides with it, and the customer picker is given a slightly more comfortable width on laptops while staying full-width on mobile.</w:t>
+      </w:r>
+    </w:p>
+    <w:p>
+      <w:pPr>
         <w:pStyle w:val="Heading1"/>
         <w:pageBreakBefore/>
       </w:pPr>
@@ -2116,6 +2124,29 @@
           <w:color w:val="555555"/>
         </w:rPr>
         <w:t xml:space="preserve">Detailed notes for each release, most recent first.</w:t>
+      </w:r>
+    </w:p>
+    <w:p>
+      <w:pPr>
+        <w:pStyle w:val="Heading2"/>
+      </w:pPr>
+      <w:r>
+        <w:t>v0.51.5 — polished select controls</w:t>
+      </w:r>
+    </w:p>
+    <w:p>
+      <w:r>
+        <w:t>The Receipts customer picker prompted a broader fix. The .input class styled text inputs cleanly but did nothing for native &lt;select&gt; elements, so every dropdown in the app fell back to the browser's default arrow — a different height and arrow style than the surrounding inputs, with long option text able to crowd the arrow.</w:t>
+      </w:r>
+    </w:p>
+    <w:p>
+      <w:r>
+        <w:t>A single app-wide rule now styles select.input: the OS arrow is removed (appearance: none, plus the IE ::-ms-expand reset) and replaced with a themed SVG chevron — muted grey in light mode, soft blue-grey in dark — positioned at the right with 2rem of padding reserved so option text never collides with it. Because it keys off the existing .input class, every select in the app (Receipts, Procurement, Sales, the admin forms) is now consistent with the text inputs at no per-field cost.</w:t>
+      </w:r>
+    </w:p>
+    <w:p>
+      <w:r>
+        <w:t>The Receipts 'Select a customer' control specifically was given a touch more width on laptops (w-80) while remaining full-width on mobile, so the page's primary control reads cleanly at both sizes. TypeScript is clean.</w:t>
       </w:r>
     </w:p>
     <w:p>

</xml_diff>